<commit_message>
fix: A4 page size, gold line tighter to letterhead, reduced header spacing
</commit_message>
<xml_diff>
--- a/docs/Meta-WhatsApp-Setup-Guide.docx
+++ b/docs/Meta-WhatsApp-Setup-Guide.docx
@@ -2548,8 +2548,8 @@
     </w:p>
     <w:sectPr>
       <w:headerReference w:type="default" r:id="rId9"/>
-      <w:pgSz w:w="12240" w:h="15840"/>
-      <w:pgMar w:top="1984" w:right="1417" w:bottom="1134" w:left="1417" w:header="170" w:footer="720" w:gutter="0"/>
+      <w:pgSz w:w="11906" w:h="16838"/>
+      <w:pgMar w:top="2268" w:right="1417" w:bottom="1134" w:left="1417" w:header="283" w:footer="720" w:gutter="0"/>
       <w:cols w:space="720"/>
       <w:docGrid w:linePitch="360"/>
     </w:sectPr>

</xml_diff>

<commit_message>
fix: remove gold line from header — letterhead image is clean on its own
</commit_message>
<xml_diff>
--- a/docs/Meta-WhatsApp-Setup-Guide.docx
+++ b/docs/Meta-WhatsApp-Setup-Guide.docx
@@ -2549,7 +2549,7 @@
     <w:sectPr>
       <w:headerReference w:type="default" r:id="rId9"/>
       <w:pgSz w:w="11906" w:h="16838"/>
-      <w:pgMar w:top="2268" w:right="1417" w:bottom="1134" w:left="1417" w:header="283" w:footer="720" w:gutter="0"/>
+      <w:pgMar w:top="2154" w:right="1417" w:bottom="1134" w:left="1417" w:header="283" w:footer="720" w:gutter="0"/>
       <w:cols w:space="720"/>
       <w:docGrid w:linePitch="360"/>
     </w:sectPr>
@@ -2598,13 +2598,6 @@
         </wp:inline>
       </w:drawing>
     </w:r>
-  </w:p>
-  <w:p>
-    <w:pPr>
-      <w:pBdr>
-        <w:bottom w:val="single" w:sz="6" w:space="1" w:color="B8860B"/>
-      </w:pBdr>
-    </w:pPr>
   </w:p>
 </w:hdr>
 </file>

</xml_diff>